<commit_message>
with the morning briefing set up
</commit_message>
<xml_diff>
--- a/Knows_me_coach.docx
+++ b/Knows_me_coach.docx
@@ -26,7 +26,7 @@
         </w:numPr>
       </w:pPr>
       <w:r>
-        <w:t>We often fetch from the DB, do we have cache for this?</w:t>
+        <w:t>AWS Lambda or Oracle Ubuntu? Or both? I need to deploy the lambda anyway</w:t>
       </w:r>
     </w:p>
     <w:p>
@@ -38,7 +38,7 @@
         </w:numPr>
       </w:pPr>
       <w:r>
-        <w:t>Make it know to create a description for the Claude Code to follow, specific rules such as creating explanation for all, avoiding code duplication and how we make sure the code is produced in the same trend and way.</w:t>
+        <w:t>We often fetch from the DB, do we have cache for this?</w:t>
       </w:r>
     </w:p>
     <w:p>
@@ -50,22 +50,7 @@
         </w:numPr>
       </w:pPr>
       <w:r>
-        <w:t>I've noticed that when the user wrote /remember som</w:t>
-      </w:r>
-      <w:r>
-        <w:t>e</w:t>
-      </w:r>
-      <w:r>
-        <w:t>thing it happen</w:t>
-      </w:r>
-      <w:r>
-        <w:t>s</w:t>
-      </w:r>
-      <w:r>
-        <w:t xml:space="preserve"> well (got into the coach notes) but I also want that when the user writes something important such as that he broke his leg it will get into that notes. </w:t>
-      </w:r>
-      <w:r>
-        <w:t>Should it be like that or only by the remember command?</w:t>
+        <w:t>Make it know to create a description for the Claude Code to follow, specific rules such as creating explanation for all, avoiding code duplication and how we make sure the code is produced in the same trend and way.</w:t>
       </w:r>
     </w:p>
     <w:p>
@@ -77,7 +62,22 @@
         </w:numPr>
       </w:pPr>
       <w:r>
-        <w:t>Add an alarm set up for every day at 10:00.</w:t>
+        <w:t>I've noticed that when the user wrote /remember som</w:t>
+      </w:r>
+      <w:r>
+        <w:t>e</w:t>
+      </w:r>
+      <w:r>
+        <w:t>thing it happen</w:t>
+      </w:r>
+      <w:r>
+        <w:t>s</w:t>
+      </w:r>
+      <w:r>
+        <w:t xml:space="preserve"> well (got into the coach notes) but I also want that when the user writes something important such as that he broke his leg it will get into that notes. </w:t>
+      </w:r>
+      <w:r>
+        <w:t>Should it be like that or only by the remember command?</w:t>
       </w:r>
     </w:p>
     <w:p>
@@ -89,6 +89,18 @@
         </w:numPr>
       </w:pPr>
       <w:r>
+        <w:t>Add an alarm set up for every day at 10:00.</w:t>
+      </w:r>
+    </w:p>
+    <w:p>
+      <w:pPr>
+        <w:pStyle w:val="ListParagraph"/>
+        <w:numPr>
+          <w:ilvl w:val="0"/>
+          <w:numId w:val="8"/>
+        </w:numPr>
+      </w:pPr>
+      <w:r>
         <w:t>Send some pictures or videos (?)</w:t>
       </w:r>
     </w:p>
@@ -278,6 +290,7 @@
         </w:numPr>
       </w:pPr>
       <w:r>
+        <w:lastRenderedPageBreak/>
         <w:t>Share a challenge with a friend who also uses the app — the agent tracks both and gives light competitive nudges</w:t>
       </w:r>
     </w:p>
@@ -289,7 +302,6 @@
         </w:numPr>
       </w:pPr>
       <w:r>
-        <w:lastRenderedPageBreak/>
         <w:t>Public route sharing so users can discover routes others in their city have used</w:t>
       </w:r>
     </w:p>

</xml_diff>

<commit_message>
ts added to history
</commit_message>
<xml_diff>
--- a/Knows_me_coach.docx
+++ b/Knows_me_coach.docx
@@ -26,7 +26,7 @@
         </w:numPr>
       </w:pPr>
       <w:r>
-        <w:t>AWS Lambda or Oracle Ubuntu? Or both? I need to deploy the lambda anyway</w:t>
+        <w:t>Send some pictures or videos (?)</w:t>
       </w:r>
     </w:p>
     <w:p>
@@ -38,70 +38,11 @@
         </w:numPr>
       </w:pPr>
       <w:r>
-        <w:t>We often fetch from the DB, do we have cache for this?</w:t>
-      </w:r>
-    </w:p>
-    <w:p>
-      <w:pPr>
-        <w:pStyle w:val="ListParagraph"/>
-        <w:numPr>
-          <w:ilvl w:val="0"/>
-          <w:numId w:val="8"/>
-        </w:numPr>
-      </w:pPr>
-      <w:r>
-        <w:t>Make it know to create a description for the Claude Code to follow, specific rules such as creating explanation for all, avoiding code duplication and how we make sure the code is produced in the same trend and way.</w:t>
-      </w:r>
-    </w:p>
-    <w:p>
-      <w:pPr>
-        <w:pStyle w:val="ListParagraph"/>
-        <w:numPr>
-          <w:ilvl w:val="0"/>
-          <w:numId w:val="8"/>
-        </w:numPr>
-      </w:pPr>
-      <w:r>
-        <w:t>I've noticed that when the user wrote /remember som</w:t>
+        <w:t xml:space="preserve">Look at today's last msg: {"role": "assistant", "content": "You're right to call that out \u2014 but I don't actually see a previous morning briefing in our conversation. This is all I have access to. \ud83d\ude4f\n\nSo I can't tell you what changed or why I said rest earlier.\n\n**But based on what I see right now:**\nYour data looks great \u2014 sleep 93/100, last strength session was 2 days ago, easy run yesterday. Objectively you're good to train.\n\nIf I told you to rest this morning, I probably had a reason \u2014 did I mention why? That would help me give you a consistent answer \ud83d\udc47"}] </w:t>
       </w:r>
       <w:r>
-        <w:t>e</w:t>
-      </w:r>
-      <w:r>
-        <w:t>thing it happen</w:t>
-      </w:r>
-      <w:r>
-        <w:t>s</w:t>
-      </w:r>
-      <w:r>
-        <w:t xml:space="preserve"> well (got into the coach notes) but I also want that when the user writes something important such as that he broke his leg it will get into that notes. </w:t>
-      </w:r>
-      <w:r>
-        <w:t>Should it be like that or only by the remember command?</w:t>
-      </w:r>
-    </w:p>
-    <w:p>
-      <w:pPr>
-        <w:pStyle w:val="ListParagraph"/>
-        <w:numPr>
-          <w:ilvl w:val="0"/>
-          <w:numId w:val="8"/>
-        </w:numPr>
-      </w:pPr>
-      <w:r>
-        <w:t>Add an alarm set up for every day at 10:00.</w:t>
-      </w:r>
-    </w:p>
-    <w:p>
-      <w:pPr>
-        <w:pStyle w:val="ListParagraph"/>
-        <w:numPr>
-          <w:ilvl w:val="0"/>
-          <w:numId w:val="8"/>
-        </w:numPr>
-      </w:pPr>
-      <w:r>
-        <w:t>Send some pictures or videos (?)</w:t>
+        <w:br/>
+        <w:t>Why didn’t it see the morning’s msg? Are the morning briefings not saved in the history table?</w:t>
       </w:r>
     </w:p>
     <w:p>
@@ -290,7 +231,6 @@
         </w:numPr>
       </w:pPr>
       <w:r>
-        <w:lastRenderedPageBreak/>
         <w:t>Share a challenge with a friend who also uses the app — the agent tracks both and gives light competitive nudges</w:t>
       </w:r>
     </w:p>
@@ -302,10 +242,23 @@
         </w:numPr>
       </w:pPr>
       <w:r>
+        <w:lastRenderedPageBreak/>
         <w:t>Public route sharing so users can discover routes others in their city have used</w:t>
       </w:r>
     </w:p>
     <w:p/>
+    <w:p/>
+    <w:p/>
+    <w:p/>
+    <w:p>
+      <w:r>
+        <w:t xml:space="preserve">[{"role": "user", "content": "And if I do a workout every day but like- A B run, is it not good?"}, {"role": "assistant", "content": "Great question! Let's think through it \ud83d\udc47\n\n**A \u2192 B \u2192 Run \u2192 A \u2192 B \u2192 Run\u2026**\n\nThis is actually a solid structure. Here's the breakdown:\n\n**\u2705 What works well:**\n- Muscle groups get ~48h rest before hitting them again\n- Running days act as active recovery between lifts\n- Consistent daily habit = better long-term results\n\n**\u26a0\ufe0f One thing to watch:**\nRunning the day after a heavy leg day (A) can feel rough \u2014 your quads and glutes are already taxed. So the sequence matters a bit.\n\n**Better ordering:**\n&gt; A \u2192 B \u2192 Run \u2192 A \u2192 B \u2192 Run \u2192 rest (or easy walk)\n\nThis way you never run right after leg day.\n\n---\n\n**For your goal (muscle mass), the main risk isn't the frequency \u2014 it's recovery.** 7 days straight with no full rest day means your body never fully resets.\n\nMy suggestion: keep the A/B/Run rotation, but **slot in one full rest day per week**, ideally after the second run.\n\nAre you currently doing this rotation, or thinking about starting it? I can build you a proper weekly plan around it \ud83d\udcaa"}, {"role": "user", "content": "What is the leg day? A?"}, {"role": "assistant", "content": "Yeah, **A = Chest, Legs &amp; Triceps** based on what you told me earlier.\n\nBit of an unusual combo tbh \u2014 most people separate chest and legs since both are heavy compound days and together they make for a brutal session \ud83d\ude05\n\nIs that intentional? Or would you want to tweak the split?"}, {"role": "user", "content": "Tell me what you think, should I split it another way? Or do push pull legs? I am free to hear you out"}, {"role": "assistant", "content": "Okay, honest opinion \ud83d\udc47\n\n**Your current split (A/B) has a problem:**\nChest + Legs + Triceps in one session is a LOT. Legs alone can wipe you out \u2014 then adding chest and triceps on top means one of them always gets a half-effort workout. Not ideal for muscle mass.\n\n---\n\n**For your goal (muscle mass, 5 days), I'd actually recommend Push/Pull/Legs:**\n\n| Day | Focus |\n|-----|-------|\n| Push | Chest, Shoulders, Triceps |\n| Pull | Back, Biceps |\n| Legs | Quads, Hamstrings, Glutes, Calves |\n| Push | Repeat |\n| Pull | Repeat |\n\nThen fit **runs on rest days** when you feel like it.\n\n**Why PPL works better for you:**\n- Each muscle gets ~2x per week stimulus \ud83d\udcaa\n- Sessions are focused, not overloaded\n- 70 min per session fits perfectly\n- Legs gets its OWN dedicated day (as it deserves)\n\n---\n\n**vs your A/B split:**\nA/B is fine for 4 days/week but gets messy at 5+ days and the chest+legs combo is genuinely holding you back.\n\n---\n\nMy honest recommendation: **switch to PPL.** Want me to build you a full PPL plan tailored to your level and goals? \ud83c\udfcb\ufe0f"}, {"role": "user", "content": "Yea but before that, should I run twice a week? And when should I do abs?"}, {"role": "assistant", "content": "Good questions, let's settle both:\n\n---\n\n**\ud83c\udfc3 Running \u2014 twice a week?**\n\nFor your goal (muscle mass), yes \u2014 **twice a week is the sweet spot.**\n- Keeps your cardio solid without eating into recovery\n- More than that starts competing with muscle growth\n- Your recent runs (41min, 29min) are at a good easy pace \u2014 keep them that way, don't go hard\n\nBest placement: **after Pull days or on rest days**, never after Legs.\n\n---\n\n**\ud83d\udcaa Abs \u2014 when?**\n\nTwo options:\n\n**Option A \u2014 Tag them onto a session (easiest)**\nAdd 10min of abs at the </w:t>
+      </w:r>
+      <w:r>
+        <w:lastRenderedPageBreak/>
+        <w:t>end of Push or Pull days. Legs day you're already dead \ud83d\ude05\n\n**Option B \u2014 Every day as a warmup**\n2-3 ab exercises before any workout. Builds consistency fast.\n\nMy recommendation: **Option A, twice a week** (end of Push day). At your level that's enough stimulus if you're training hard compounds \u2014 deadlifts and squats already hammer your core.\n\n---\n\n**So your weekly structure would look like:**\n\n| Day | Session |\n|-----|---------|\n| Mon | Push + Abs |\n| Tue | Pull |\n| Wed | Run |\n| Thu | Legs |\n| Fri | Push + Abs |\n| Sat | Pull |\n| Sun | Run |\n\nClean, balanced, sustainable. Want me to now build the full exercise plan? \ud83d\udcaa"}, {"role": "user", "content": "Yes do it"}, {"role": "assistant", "content": "Here it is \ud83d\udc47\n\n---\n\n**\ud83d\udd34 PUSH DAY (+ Abs) \u2014 70 min**\n\n| Exercise | Sets x Reps |\n|----------|-------------|\n| Barbell Bench Press | 4x6-8 |\n| Incline Dumbbell Press | 3x8-10 |\n| Cable Lateral Raises | 3x12-15 |\n| Overhead Press (DB or Bar) | 3x8-10 |\n| Tricep Rope Pushdown | 3x10-12 |\n| Overhead Tricep Extension | 3x10-12 |\n| **Abs:** Hanging Leg Raises | 3x12 |\n| **Abs:** Cable Crunch | 3x15 |\n\n---\n\n**\ud83d\udd35 PULL DAY \u2014 70 min**\n\n| Exercise | Sets x Reps |\n|----------|-------------|\n| Deadlift | 4x5 |\n| Pull-ups (weighted if possible) | 4x6-8 |\n| Barbell Row | 3x8-10 |\n| Cable Row (narrow grip) | 3x10-12 |\n| Face Pulls | 3x15 |\n| Incline Dumbbell Curl | 3x10-12 |\n| Hammer Curl | 3x10-12 |\n\n---\n\n**\ud83d\udfe2 LEGS DAY \u2014 70 min**\n\n| Exercise | Sets x Reps |\n|----------|-------------|\n| Barbell Squat | 4x6-8 |\n| Romanian Deadlift | 3x8-10 |\n| Leg Press | 3x10-12 |\n| Walking Lunges | 3x12 each |\n| Leg Curl (machine) | 3x12 |\n| Calf Raises | 4x15 |\n\n---\n\n**\ud83c\udfc3 RUN DAYS**\nKeep it easy \u2014 30-45 min, conversational pace. No need to kill yourself.\n\n---\n\nA few notes:\n- **Start heavier compounds** while you're fresh\n- **Progressive overload** \u2014 try to add weight or reps every 1-2 weeks\n- Rest 2-3 min on big lifts, 60-90 sec on isolation\n\n---\n\nDo you have all this equipment available at your gym? And want me to set this as your new plan going forward? \ud83d\udcaa"}, {"role": "user", "content": "Yes let\u2019s try it. And today should i rest?"}, {"role": "assistant", "content": "Updated your plan \u2014 PPL it is \ud83d\udcaa\n\n**As for today** \u2014 let's look at your data:\n\n- \ud83d\ude34 Sleep: 93/100, 9h+ \u2014 you're fully recovered\n- \ud83c\udfc3 Last workout: Easy run yesterday (41min, low HR)\n- \ud83d\udcaa Last strength: 2 days ago\n\nYou're actually **well rested and ready to train.** No reason to rest today.\n\nBased on the schedule we just built, today would be a **Push day** \u2014 perfect since your last strength session was Pull/Legs area.\n\n**My call: Train today. Push + Abs.** \ud83d\udcaa\n\nWant me to send you the Push session as a clean checklist you can take to the gym?"}, {"role": "user", "content": "But in the morning briefing you told me to rest today, do you see that message? What has changed?"}, {"role": "assistant", "content": "You're right to call that out \u2014 but I don't actually see a previous morning briefing in our conversation. This is all I have access to. \ud83d\ude4f\n\nSo I can't tell you what changed or why I said rest earlier.\n\n**But based on what I see right now:**\nYour data looks great \u2014 sleep 93/100, last strength session was 2 days ago, easy run yesterday. Objectively you're good to train.\n\nIf I told you to rest this morning, I probably had a reason \u2014 did I mention why? That would help me give you a consistent answer \ud83d\udc47"}]</w:t>
+      </w:r>
+    </w:p>
     <w:sectPr>
       <w:pgSz w:w="11906" w:h="16838"/>
       <w:pgMar w:top="1440" w:right="1440" w:bottom="1440" w:left="1440" w:header="708" w:footer="708" w:gutter="0"/>

</xml_diff>

<commit_message>
Reshaped the morning briefing
</commit_message>
<xml_diff>
--- a/Knows_me_coach.docx
+++ b/Knows_me_coach.docx
@@ -3,19 +3,410 @@
 <w:document xmlns:wpc="http://schemas.microsoft.com/office/word/2010/wordprocessingCanvas" xmlns:cx="http://schemas.microsoft.com/office/drawing/2014/chartex" xmlns:cx1="http://schemas.microsoft.com/office/drawing/2015/9/8/chartex" xmlns:cx2="http://schemas.microsoft.com/office/drawing/2015/10/21/chartex" xmlns:cx3="http://schemas.microsoft.com/office/drawing/2016/5/9/chartex" xmlns:cx4="http://schemas.microsoft.com/office/drawing/2016/5/10/chartex" xmlns:cx5="http://schemas.microsoft.com/office/drawing/2016/5/11/chartex" xmlns:cx6="http://schemas.microsoft.com/office/drawing/2016/5/12/chartex" xmlns:cx7="http://schemas.microsoft.com/office/drawing/2016/5/13/chartex" xmlns:cx8="http://schemas.microsoft.com/office/drawing/2016/5/14/chartex" xmlns:mc="http://schemas.openxmlformats.org/markup-compatibility/2006" xmlns:aink="http://schemas.microsoft.com/office/drawing/2016/ink" xmlns:am3d="http://schemas.microsoft.com/office/drawing/2017/model3d" xmlns:o="urn:schemas-microsoft-com:office:office" xmlns:oel="http://schemas.microsoft.com/office/2019/extlst" xmlns:r="http://schemas.openxmlformats.org/officeDocument/2006/relationships" xmlns:m="http://schemas.openxmlformats.org/officeDocument/2006/math" xmlns:v="urn:schemas-microsoft-com:vml" xmlns:wp14="http://schemas.microsoft.com/office/word/2010/wordprocessingDrawing" xmlns:wp="http://schemas.openxmlformats.org/drawingml/2006/wordprocessingDrawing" xmlns:w10="urn:schemas-microsoft-com:office:word" xmlns:w="http://schemas.openxmlformats.org/wordprocessingml/2006/main" xmlns:w14="http://schemas.microsoft.com/office/word/2010/wordml" xmlns:w15="http://schemas.microsoft.com/office/word/2012/wordml" xmlns:w16cex="http://schemas.microsoft.com/office/word/2018/wordml/cex" xmlns:w16cid="http://schemas.microsoft.com/office/word/2016/wordml/cid" xmlns:w16="http://schemas.microsoft.com/office/word/2018/wordml" xmlns:w16du="http://schemas.microsoft.com/office/word/2023/wordml/word16du" xmlns:w16sdtdh="http://schemas.microsoft.com/office/word/2020/wordml/sdtdatahash" xmlns:w16sdtfl="http://schemas.microsoft.com/office/word/2024/wordml/sdtformatlock" xmlns:w16se="http://schemas.microsoft.com/office/word/2015/wordml/symex" xmlns:wpg="http://schemas.microsoft.com/office/word/2010/wordprocessingGroup" xmlns:wpi="http://schemas.microsoft.com/office/word/2010/wordprocessingInk" xmlns:wne="http://schemas.microsoft.com/office/word/2006/wordml" xmlns:wps="http://schemas.microsoft.com/office/word/2010/wordprocessingShape" mc:Ignorable="w14 w15 w16se w16cid w16 w16cex w16sdtdh w16sdtfl w16du wp14">
   <w:body>
     <w:p>
-      <w:pPr>
+      <w:r>
         <w:rPr>
           <w:b/>
           <w:bCs/>
         </w:rPr>
-      </w:pPr>
-      <w:r>
+        <w:t>TO DO:</w:t>
+      </w:r>
+    </w:p>
+    <w:p>
+      <w:pPr>
+        <w:rPr>
+          <w:lang w:val="en-IL"/>
+        </w:rPr>
+      </w:pPr>
+      <w:r>
+        <w:rPr>
+          <w:lang w:val="en-IL"/>
+        </w:rPr>
+        <w:t>/</w:t>
+      </w:r>
+      <w:r>
+        <w:rPr>
+          <w:highlight w:val="yellow"/>
+          <w:lang w:val="en-IL"/>
+        </w:rPr>
+        <w:t>start</w:t>
+      </w:r>
+      <w:r>
+        <w:rPr>
+          <w:lang w:val="en-IL"/>
+        </w:rPr>
+        <w:t> Profile Wizard — Implementation Summary</w:t>
+      </w:r>
+    </w:p>
+    <w:p>
+      <w:pPr>
+        <w:rPr>
+          <w:lang w:val="en-IL"/>
+        </w:rPr>
+      </w:pPr>
+      <w:r>
+        <w:rPr>
+          <w:lang w:val="en-IL"/>
+        </w:rPr>
+        <w:t>What it should do</w:t>
+      </w:r>
+    </w:p>
+    <w:p>
+      <w:pPr>
+        <w:rPr>
+          <w:lang w:val="en-IL"/>
+        </w:rPr>
+      </w:pPr>
+      <w:r>
+        <w:rPr>
+          <w:lang w:val="en-IL"/>
+        </w:rPr>
+        <w:t>When /start is called, check if the profile in DynamoDB has all required fields. If fields are missing, run a sequential wizard before anything else. If the profile is already complete, just greet and show available commands.</w:t>
+      </w:r>
+    </w:p>
+    <w:p>
+      <w:pPr>
+        <w:rPr>
+          <w:lang w:val="en-IL"/>
+        </w:rPr>
+      </w:pPr>
+      <w:r>
+        <w:rPr>
+          <w:lang w:val="en-IL"/>
+        </w:rPr>
+        <w:t>Fields to collect (in order)</w:t>
+      </w:r>
+    </w:p>
+    <w:p>
+      <w:pPr>
+        <w:numPr>
+          <w:ilvl w:val="0"/>
+          <w:numId w:val="9"/>
+        </w:numPr>
+        <w:rPr>
+          <w:lang w:val="en-IL"/>
+        </w:rPr>
+      </w:pPr>
+      <w:r>
+        <w:rPr>
+          <w:lang w:val="en-IL"/>
+        </w:rPr>
+        <w:t>Name — free text</w:t>
+      </w:r>
+    </w:p>
+    <w:p>
+      <w:pPr>
+        <w:numPr>
+          <w:ilvl w:val="0"/>
+          <w:numId w:val="9"/>
+        </w:numPr>
+        <w:rPr>
+          <w:lang w:val="en-IL"/>
+        </w:rPr>
+      </w:pPr>
+      <w:r>
+        <w:rPr>
+          <w:lang w:val="en-IL"/>
+        </w:rPr>
+        <w:t>Age — number</w:t>
+      </w:r>
+    </w:p>
+    <w:p>
+      <w:pPr>
+        <w:numPr>
+          <w:ilvl w:val="0"/>
+          <w:numId w:val="9"/>
+        </w:numPr>
+        <w:rPr>
+          <w:lang w:val="en-IL"/>
+        </w:rPr>
+      </w:pPr>
+      <w:r>
+        <w:rPr>
+          <w:lang w:val="en-IL"/>
+        </w:rPr>
+        <w:t>Weight — number (kg)</w:t>
+      </w:r>
+    </w:p>
+    <w:p>
+      <w:pPr>
+        <w:numPr>
+          <w:ilvl w:val="0"/>
+          <w:numId w:val="9"/>
+        </w:numPr>
+        <w:rPr>
+          <w:lang w:val="en-IL"/>
+        </w:rPr>
+      </w:pPr>
+      <w:r>
+        <w:rPr>
+          <w:lang w:val="en-IL"/>
+        </w:rPr>
+        <w:t>Goal — inline keyboard: Cut / Maintain / Bulk</w:t>
+      </w:r>
+    </w:p>
+    <w:p>
+      <w:pPr>
+        <w:numPr>
+          <w:ilvl w:val="0"/>
+          <w:numId w:val="9"/>
+        </w:numPr>
+        <w:rPr>
+          <w:lang w:val="en-IL"/>
+        </w:rPr>
+      </w:pPr>
+      <w:r>
+        <w:rPr>
+          <w:lang w:val="en-IL"/>
+        </w:rPr>
+        <w:t>Fitness level — inline keyboard: Beginner / Intermediate / Advanced</w:t>
+      </w:r>
+    </w:p>
+    <w:p>
+      <w:pPr>
+        <w:numPr>
+          <w:ilvl w:val="0"/>
+          <w:numId w:val="9"/>
+        </w:numPr>
+        <w:rPr>
+          <w:lang w:val="en-IL"/>
+        </w:rPr>
+      </w:pPr>
+      <w:r>
+        <w:rPr>
+          <w:lang w:val="en-IL"/>
+        </w:rPr>
+        <w:t>Weekly training days — number (1–7)</w:t>
+      </w:r>
+    </w:p>
+    <w:p>
+      <w:pPr>
+        <w:numPr>
+          <w:ilvl w:val="0"/>
+          <w:numId w:val="9"/>
+        </w:numPr>
+        <w:rPr>
+          <w:lang w:val="en-IL"/>
+        </w:rPr>
+      </w:pPr>
+      <w:r>
+        <w:rPr>
+          <w:lang w:val="en-IL"/>
+        </w:rPr>
+        <w:t>Session duration — number in minutes (default suggestion: 60)</w:t>
+      </w:r>
+    </w:p>
+    <w:p>
+      <w:pPr>
+        <w:numPr>
+          <w:ilvl w:val="0"/>
+          <w:numId w:val="9"/>
+        </w:numPr>
+        <w:rPr>
+          <w:lang w:val="en-IL"/>
+        </w:rPr>
+      </w:pPr>
+      <w:r>
+        <w:rPr>
+          <w:lang w:val="en-IL"/>
+        </w:rPr>
+        <w:t>Dietary restrictions — free text, or "None" button to skip</w:t>
+      </w:r>
+    </w:p>
+    <w:p>
+      <w:pPr>
+        <w:rPr>
+          <w:lang w:val="en-IL"/>
+        </w:rPr>
+      </w:pPr>
+      <w:r>
+        <w:rPr>
+          <w:lang w:val="en-IL"/>
+        </w:rPr>
+        <w:t>Where data lives</w:t>
+      </w:r>
+    </w:p>
+    <w:p>
+      <w:pPr>
+        <w:rPr>
+          <w:lang w:val="en-IL"/>
+        </w:rPr>
+      </w:pPr>
+      <w:r>
+        <w:rPr>
+          <w:lang w:val="en-IL"/>
+        </w:rPr>
+        <w:t>All fields saved to DynamoDB via storage.save_profile(). Map to existing keys used by workout_recommender.py:</w:t>
+      </w:r>
+    </w:p>
+    <w:p>
+      <w:pPr>
+        <w:numPr>
+          <w:ilvl w:val="0"/>
+          <w:numId w:val="10"/>
+        </w:numPr>
+        <w:rPr>
+          <w:lang w:val="en-IL"/>
+        </w:rPr>
+      </w:pPr>
+      <w:r>
+        <w:rPr>
+          <w:lang w:val="en-IL"/>
+        </w:rPr>
+        <w:t>name, age, weight_kg, primary_goal, fitness_level, weekly_training_days, preferred_session_duration_minutes, dietary_restrictions</w:t>
+      </w:r>
+    </w:p>
+    <w:p>
+      <w:pPr>
+        <w:rPr>
+          <w:lang w:val="en-IL"/>
+        </w:rPr>
+      </w:pPr>
+      <w:r>
+        <w:rPr>
+          <w:lang w:val="en-IL"/>
+        </w:rPr>
+        <w:t>Implementation approach</w:t>
+      </w:r>
+    </w:p>
+    <w:p>
+      <w:pPr>
+        <w:numPr>
+          <w:ilvl w:val="0"/>
+          <w:numId w:val="11"/>
+        </w:numPr>
+        <w:rPr>
+          <w:lang w:val="en-IL"/>
+        </w:rPr>
+      </w:pPr>
+      <w:r>
+        <w:rPr>
+          <w:lang w:val="en-IL"/>
+        </w:rPr>
+        <w:t>Use PTB's ConversationHandler with one state per question</w:t>
+      </w:r>
+    </w:p>
+    <w:p>
+      <w:pPr>
+        <w:numPr>
+          <w:ilvl w:val="0"/>
+          <w:numId w:val="11"/>
+        </w:numPr>
+        <w:rPr>
+          <w:lang w:val="en-IL"/>
+        </w:rPr>
+      </w:pPr>
+      <w:r>
+        <w:rPr>
+          <w:lang w:val="en-IL"/>
+        </w:rPr>
+        <w:t>On /start: load profile → skip already-filled fields → start wizard from first missing field</w:t>
+      </w:r>
+    </w:p>
+    <w:p>
+      <w:pPr>
+        <w:numPr>
+          <w:ilvl w:val="0"/>
+          <w:numId w:val="11"/>
+        </w:numPr>
+        <w:rPr>
+          <w:lang w:val="en-IL"/>
+        </w:rPr>
+      </w:pPr>
+      <w:r>
+        <w:rPr>
+          <w:lang w:val="en-IL"/>
+        </w:rPr>
+        <w:t>On completion: save profile, send confirmation, show available commands (/morning, /clear, etc.)</w:t>
+      </w:r>
+    </w:p>
+    <w:p>
+      <w:pPr>
+        <w:numPr>
+          <w:ilvl w:val="0"/>
+          <w:numId w:val="11"/>
+        </w:numPr>
+        <w:rPr>
+          <w:lang w:val="en-IL"/>
+        </w:rPr>
+      </w:pPr>
+      <w:r>
+        <w:rPr>
+          <w:lang w:val="en-IL"/>
+        </w:rPr>
+        <w:t>/profile command reuses the same ConversationHandler to let you update any field later</w:t>
+      </w:r>
+    </w:p>
+    <w:p>
+      <w:pPr>
+        <w:rPr>
+          <w:lang w:val="en-IL"/>
+        </w:rPr>
+      </w:pPr>
+      <w:r>
+        <w:rPr>
+          <w:lang w:val="en-IL"/>
+        </w:rPr>
+        <w:t>Files to touch</w:t>
+      </w:r>
+    </w:p>
+    <w:p>
+      <w:pPr>
+        <w:numPr>
+          <w:ilvl w:val="0"/>
+          <w:numId w:val="12"/>
+        </w:numPr>
+        <w:rPr>
+          <w:lang w:val="en-IL"/>
+        </w:rPr>
+      </w:pPr>
+      <w:r>
+        <w:rPr>
+          <w:lang w:val="en-IL"/>
+        </w:rPr>
+        <w:t>bot.py — add ConversationHandler, replace current start() handler</w:t>
+      </w:r>
+    </w:p>
+    <w:p>
+      <w:pPr>
+        <w:numPr>
+          <w:ilvl w:val="0"/>
+          <w:numId w:val="12"/>
+        </w:numPr>
+        <w:rPr>
+          <w:lang w:val="en-IL"/>
+        </w:rPr>
+      </w:pPr>
+      <w:r>
+        <w:rPr>
+          <w:lang w:val="en-IL"/>
+        </w:rPr>
+        <w:t>storage.py — no changes needed, save_profile already handles this</w:t>
+      </w:r>
+    </w:p>
+    <w:p>
+      <w:pPr>
         <w:rPr>
           <w:b/>
           <w:bCs/>
-        </w:rPr>
-        <w:t>TO DO:</w:t>
-      </w:r>
+          <w:lang w:val="en-IL"/>
+        </w:rPr>
+      </w:pPr>
+    </w:p>
+    <w:p>
+      <w:pPr>
+        <w:rPr>
+          <w:b/>
+          <w:bCs/>
+        </w:rPr>
+      </w:pPr>
+    </w:p>
+    <w:p>
+      <w:pPr>
+        <w:rPr>
+          <w:b/>
+          <w:bCs/>
+        </w:rPr>
+      </w:pPr>
     </w:p>
     <w:p>
       <w:pPr>
@@ -25,9 +416,6 @@
           <w:numId w:val="8"/>
         </w:numPr>
       </w:pPr>
-      <w:r>
-        <w:t>Send some pictures or videos (?)</w:t>
-      </w:r>
     </w:p>
     <w:p>
       <w:pPr>
@@ -38,24 +426,46 @@
         </w:numPr>
       </w:pPr>
       <w:r>
-        <w:t xml:space="preserve">Look at today's last msg: {"role": "assistant", "content": "You're right to call that out \u2014 but I don't actually see a previous morning briefing in our conversation. This is all I have access to. \ud83d\ude4f\n\nSo I can't tell you what changed or why I said rest earlier.\n\n**But based on what I see right now:**\nYour data looks great \u2014 sleep 93/100, last strength session was 2 days ago, easy run yesterday. Objectively you're good to train.\n\nIf I told you to rest this morning, I probably had a reason \u2014 did I mention why? That would help me give you a consistent answer \ud83d\udc47"}] </w:t>
-      </w:r>
-      <w:r>
-        <w:br/>
-        <w:t>Why didn’t it see the morning’s msg? Are the morning briefings not saved in the history table?</w:t>
+        <w:rPr>
+          <w:highlight w:val="yellow"/>
+        </w:rPr>
+        <w:t>Get</w:t>
+      </w:r>
+      <w:r>
+        <w:t xml:space="preserve"> the morning briefing with all the clickable topics.</w:t>
       </w:r>
     </w:p>
     <w:p>
       <w:pPr>
         <w:pStyle w:val="ListParagraph"/>
-      </w:pPr>
-      <w:r>
-        <w:rPr>
-          <w:i/>
-          <w:iCs/>
-        </w:rPr>
-        <w:t xml:space="preserve"> </w:t>
-      </w:r>
+        <w:numPr>
+          <w:ilvl w:val="0"/>
+          <w:numId w:val="8"/>
+        </w:numPr>
+      </w:pPr>
+      <w:r>
+        <w:t>Why the “sleep” option isn’t right after the sleep? If haven’t worked out it will be at 10am.</w:t>
+      </w:r>
+    </w:p>
+    <w:p>
+      <w:pPr>
+        <w:pStyle w:val="ListParagraph"/>
+        <w:numPr>
+          <w:ilvl w:val="0"/>
+          <w:numId w:val="8"/>
+        </w:numPr>
+      </w:pPr>
+      <w:r>
+        <w:t>Send some pictures or videos (</w:t>
+      </w:r>
+      <w:r>
+        <w:t>Using Google’s Gemini Or OpenAI’s Whisper for the transcripts)</w:t>
+      </w:r>
+    </w:p>
+    <w:p>
+      <w:pPr>
+        <w:pStyle w:val="ListParagraph"/>
+      </w:pPr>
     </w:p>
     <w:p>
       <w:r>
@@ -242,22 +652,18 @@
         </w:numPr>
       </w:pPr>
       <w:r>
-        <w:lastRenderedPageBreak/>
         <w:t>Public route sharing so users can discover routes others in their city have used</w:t>
       </w:r>
     </w:p>
     <w:p/>
     <w:p/>
     <w:p/>
-    <w:p/>
-    <w:p>
-      <w:r>
-        <w:t xml:space="preserve">[{"role": "user", "content": "And if I do a workout every day but like- A B run, is it not good?"}, {"role": "assistant", "content": "Great question! Let's think through it \ud83d\udc47\n\n**A \u2192 B \u2192 Run \u2192 A \u2192 B \u2192 Run\u2026**\n\nThis is actually a solid structure. Here's the breakdown:\n\n**\u2705 What works well:**\n- Muscle groups get ~48h rest before hitting them again\n- Running days act as active recovery between lifts\n- Consistent daily habit = better long-term results\n\n**\u26a0\ufe0f One thing to watch:**\nRunning the day after a heavy leg day (A) can feel rough \u2014 your quads and glutes are already taxed. So the sequence matters a bit.\n\n**Better ordering:**\n&gt; A \u2192 B \u2192 Run \u2192 A \u2192 B \u2192 Run \u2192 rest (or easy walk)\n\nThis way you never run right after leg day.\n\n---\n\n**For your goal (muscle mass), the main risk isn't the frequency \u2014 it's recovery.** 7 days straight with no full rest day means your body never fully resets.\n\nMy suggestion: keep the A/B/Run rotation, but **slot in one full rest day per week**, ideally after the second run.\n\nAre you currently doing this rotation, or thinking about starting it? I can build you a proper weekly plan around it \ud83d\udcaa"}, {"role": "user", "content": "What is the leg day? A?"}, {"role": "assistant", "content": "Yeah, **A = Chest, Legs &amp; Triceps** based on what you told me earlier.\n\nBit of an unusual combo tbh \u2014 most people separate chest and legs since both are heavy compound days and together they make for a brutal session \ud83d\ude05\n\nIs that intentional? Or would you want to tweak the split?"}, {"role": "user", "content": "Tell me what you think, should I split it another way? Or do push pull legs? I am free to hear you out"}, {"role": "assistant", "content": "Okay, honest opinion \ud83d\udc47\n\n**Your current split (A/B) has a problem:**\nChest + Legs + Triceps in one session is a LOT. Legs alone can wipe you out \u2014 then adding chest and triceps on top means one of them always gets a half-effort workout. Not ideal for muscle mass.\n\n---\n\n**For your goal (muscle mass, 5 days), I'd actually recommend Push/Pull/Legs:**\n\n| Day | Focus |\n|-----|-------|\n| Push | Chest, Shoulders, Triceps |\n| Pull | Back, Biceps |\n| Legs | Quads, Hamstrings, Glutes, Calves |\n| Push | Repeat |\n| Pull | Repeat |\n\nThen fit **runs on rest days** when you feel like it.\n\n**Why PPL works better for you:**\n- Each muscle gets ~2x per week stimulus \ud83d\udcaa\n- Sessions are focused, not overloaded\n- 70 min per session fits perfectly\n- Legs gets its OWN dedicated day (as it deserves)\n\n---\n\n**vs your A/B split:**\nA/B is fine for 4 days/week but gets messy at 5+ days and the chest+legs combo is genuinely holding you back.\n\n---\n\nMy honest recommendation: **switch to PPL.** Want me to build you a full PPL plan tailored to your level and goals? \ud83c\udfcb\ufe0f"}, {"role": "user", "content": "Yea but before that, should I run twice a week? And when should I do abs?"}, {"role": "assistant", "content": "Good questions, let's settle both:\n\n---\n\n**\ud83c\udfc3 Running \u2014 twice a week?**\n\nFor your goal (muscle mass), yes \u2014 **twice a week is the sweet spot.**\n- Keeps your cardio solid without eating into recovery\n- More than that starts competing with muscle growth\n- Your recent runs (41min, 29min) are at a good easy pace \u2014 keep them that way, don't go hard\n\nBest placement: **after Pull days or on rest days**, never after Legs.\n\n---\n\n**\ud83d\udcaa Abs \u2014 when?**\n\nTwo options:\n\n**Option A \u2014 Tag them onto a session (easiest)**\nAdd 10min of abs at the </w:t>
-      </w:r>
-      <w:r>
-        <w:lastRenderedPageBreak/>
-        <w:t>end of Push or Pull days. Legs day you're already dead \ud83d\ude05\n\n**Option B \u2014 Every day as a warmup**\n2-3 ab exercises before any workout. Builds consistency fast.\n\nMy recommendation: **Option A, twice a week** (end of Push day). At your level that's enough stimulus if you're training hard compounds \u2014 deadlifts and squats already hammer your core.\n\n---\n\n**So your weekly structure would look like:**\n\n| Day | Session |\n|-----|---------|\n| Mon | Push + Abs |\n| Tue | Pull |\n| Wed | Run |\n| Thu | Legs |\n| Fri | Push + Abs |\n| Sat | Pull |\n| Sun | Run |\n\nClean, balanced, sustainable. Want me to now build the full exercise plan? \ud83d\udcaa"}, {"role": "user", "content": "Yes do it"}, {"role": "assistant", "content": "Here it is \ud83d\udc47\n\n---\n\n**\ud83d\udd34 PUSH DAY (+ Abs) \u2014 70 min**\n\n| Exercise | Sets x Reps |\n|----------|-------------|\n| Barbell Bench Press | 4x6-8 |\n| Incline Dumbbell Press | 3x8-10 |\n| Cable Lateral Raises | 3x12-15 |\n| Overhead Press (DB or Bar) | 3x8-10 |\n| Tricep Rope Pushdown | 3x10-12 |\n| Overhead Tricep Extension | 3x10-12 |\n| **Abs:** Hanging Leg Raises | 3x12 |\n| **Abs:** Cable Crunch | 3x15 |\n\n---\n\n**\ud83d\udd35 PULL DAY \u2014 70 min**\n\n| Exercise | Sets x Reps |\n|----------|-------------|\n| Deadlift | 4x5 |\n| Pull-ups (weighted if possible) | 4x6-8 |\n| Barbell Row | 3x8-10 |\n| Cable Row (narrow grip) | 3x10-12 |\n| Face Pulls | 3x15 |\n| Incline Dumbbell Curl | 3x10-12 |\n| Hammer Curl | 3x10-12 |\n\n---\n\n**\ud83d\udfe2 LEGS DAY \u2014 70 min**\n\n| Exercise | Sets x Reps |\n|----------|-------------|\n| Barbell Squat | 4x6-8 |\n| Romanian Deadlift | 3x8-10 |\n| Leg Press | 3x10-12 |\n| Walking Lunges | 3x12 each |\n| Leg Curl (machine) | 3x12 |\n| Calf Raises | 4x15 |\n\n---\n\n**\ud83c\udfc3 RUN DAYS**\nKeep it easy \u2014 30-45 min, conversational pace. No need to kill yourself.\n\n---\n\nA few notes:\n- **Start heavier compounds** while you're fresh\n- **Progressive overload** \u2014 try to add weight or reps every 1-2 weeks\n- Rest 2-3 min on big lifts, 60-90 sec on isolation\n\n---\n\nDo you have all this equipment available at your gym? And want me to set this as your new plan going forward? \ud83d\udcaa"}, {"role": "user", "content": "Yes let\u2019s try it. And today should i rest?"}, {"role": "assistant", "content": "Updated your plan \u2014 PPL it is \ud83d\udcaa\n\n**As for today** \u2014 let's look at your data:\n\n- \ud83d\ude34 Sleep: 93/100, 9h+ \u2014 you're fully recovered\n- \ud83c\udfc3 Last workout: Easy run yesterday (41min, low HR)\n- \ud83d\udcaa Last strength: 2 days ago\n\nYou're actually **well rested and ready to train.** No reason to rest today.\n\nBased on the schedule we just built, today would be a **Push day** \u2014 perfect since your last strength session was Pull/Legs area.\n\n**My call: Train today. Push + Abs.** \ud83d\udcaa\n\nWant me to send you the Push session as a clean checklist you can take to the gym?"}, {"role": "user", "content": "But in the morning briefing you told me to rest today, do you see that message? What has changed?"}, {"role": "assistant", "content": "You're right to call that out \u2014 but I don't actually see a previous morning briefing in our conversation. This is all I have access to. \ud83d\ude4f\n\nSo I can't tell you what changed or why I said rest earlier.\n\n**But based on what I see right now:**\nYour data looks great \u2014 sleep 93/100, last strength session was 2 days ago, easy run yesterday. Objectively you're good to train.\n\nIf I told you to rest this morning, I probably had a reason \u2014 did I mention why? That would help me give you a consistent answer \ud83d\udc47"}]</w:t>
-      </w:r>
+    <w:p>
+      <w:pPr>
+        <w:rPr>
+          <w:lang w:val="en-US"/>
+        </w:rPr>
+      </w:pPr>
     </w:p>
     <w:sectPr>
       <w:pgSz w:w="11906" w:h="16838"/>
@@ -533,6 +939,268 @@
     </w:lvl>
   </w:abstractNum>
   <w:abstractNum w:abstractNumId="2" w15:restartNumberingAfterBreak="0">
+    <w:nsid w:val="076F5556"/>
+    <w:multiLevelType w:val="multilevel"/>
+    <w:tmpl w:val="FFB8BC1E"/>
+    <w:lvl w:ilvl="0">
+      <w:start w:val="1"/>
+      <w:numFmt w:val="decimal"/>
+      <w:lvlText w:val="%1."/>
+      <w:lvlJc w:val="left"/>
+      <w:pPr>
+        <w:tabs>
+          <w:tab w:val="num" w:pos="720"/>
+        </w:tabs>
+        <w:ind w:left="720" w:hanging="360"/>
+      </w:pPr>
+    </w:lvl>
+    <w:lvl w:ilvl="1" w:tentative="1">
+      <w:start w:val="1"/>
+      <w:numFmt w:val="decimal"/>
+      <w:lvlText w:val="%2."/>
+      <w:lvlJc w:val="left"/>
+      <w:pPr>
+        <w:tabs>
+          <w:tab w:val="num" w:pos="1440"/>
+        </w:tabs>
+        <w:ind w:left="1440" w:hanging="360"/>
+      </w:pPr>
+    </w:lvl>
+    <w:lvl w:ilvl="2" w:tentative="1">
+      <w:start w:val="1"/>
+      <w:numFmt w:val="decimal"/>
+      <w:lvlText w:val="%3."/>
+      <w:lvlJc w:val="left"/>
+      <w:pPr>
+        <w:tabs>
+          <w:tab w:val="num" w:pos="2160"/>
+        </w:tabs>
+        <w:ind w:left="2160" w:hanging="360"/>
+      </w:pPr>
+    </w:lvl>
+    <w:lvl w:ilvl="3" w:tentative="1">
+      <w:start w:val="1"/>
+      <w:numFmt w:val="decimal"/>
+      <w:lvlText w:val="%4."/>
+      <w:lvlJc w:val="left"/>
+      <w:pPr>
+        <w:tabs>
+          <w:tab w:val="num" w:pos="2880"/>
+        </w:tabs>
+        <w:ind w:left="2880" w:hanging="360"/>
+      </w:pPr>
+    </w:lvl>
+    <w:lvl w:ilvl="4" w:tentative="1">
+      <w:start w:val="1"/>
+      <w:numFmt w:val="decimal"/>
+      <w:lvlText w:val="%5."/>
+      <w:lvlJc w:val="left"/>
+      <w:pPr>
+        <w:tabs>
+          <w:tab w:val="num" w:pos="3600"/>
+        </w:tabs>
+        <w:ind w:left="3600" w:hanging="360"/>
+      </w:pPr>
+    </w:lvl>
+    <w:lvl w:ilvl="5" w:tentative="1">
+      <w:start w:val="1"/>
+      <w:numFmt w:val="decimal"/>
+      <w:lvlText w:val="%6."/>
+      <w:lvlJc w:val="left"/>
+      <w:pPr>
+        <w:tabs>
+          <w:tab w:val="num" w:pos="4320"/>
+        </w:tabs>
+        <w:ind w:left="4320" w:hanging="360"/>
+      </w:pPr>
+    </w:lvl>
+    <w:lvl w:ilvl="6" w:tentative="1">
+      <w:start w:val="1"/>
+      <w:numFmt w:val="decimal"/>
+      <w:lvlText w:val="%7."/>
+      <w:lvlJc w:val="left"/>
+      <w:pPr>
+        <w:tabs>
+          <w:tab w:val="num" w:pos="5040"/>
+        </w:tabs>
+        <w:ind w:left="5040" w:hanging="360"/>
+      </w:pPr>
+    </w:lvl>
+    <w:lvl w:ilvl="7" w:tentative="1">
+      <w:start w:val="1"/>
+      <w:numFmt w:val="decimal"/>
+      <w:lvlText w:val="%8."/>
+      <w:lvlJc w:val="left"/>
+      <w:pPr>
+        <w:tabs>
+          <w:tab w:val="num" w:pos="5760"/>
+        </w:tabs>
+        <w:ind w:left="5760" w:hanging="360"/>
+      </w:pPr>
+    </w:lvl>
+    <w:lvl w:ilvl="8" w:tentative="1">
+      <w:start w:val="1"/>
+      <w:numFmt w:val="decimal"/>
+      <w:lvlText w:val="%9."/>
+      <w:lvlJc w:val="left"/>
+      <w:pPr>
+        <w:tabs>
+          <w:tab w:val="num" w:pos="6480"/>
+        </w:tabs>
+        <w:ind w:left="6480" w:hanging="360"/>
+      </w:pPr>
+    </w:lvl>
+  </w:abstractNum>
+  <w:abstractNum w:abstractNumId="3" w15:restartNumberingAfterBreak="0">
+    <w:nsid w:val="09971EEB"/>
+    <w:multiLevelType w:val="multilevel"/>
+    <w:tmpl w:val="A866D704"/>
+    <w:lvl w:ilvl="0">
+      <w:start w:val="1"/>
+      <w:numFmt w:val="bullet"/>
+      <w:lvlText w:val=""/>
+      <w:lvlJc w:val="left"/>
+      <w:pPr>
+        <w:tabs>
+          <w:tab w:val="num" w:pos="720"/>
+        </w:tabs>
+        <w:ind w:left="720" w:hanging="360"/>
+      </w:pPr>
+      <w:rPr>
+        <w:rFonts w:ascii="Symbol" w:hAnsi="Symbol" w:hint="default"/>
+        <w:sz w:val="20"/>
+      </w:rPr>
+    </w:lvl>
+    <w:lvl w:ilvl="1" w:tentative="1">
+      <w:start w:val="1"/>
+      <w:numFmt w:val="bullet"/>
+      <w:lvlText w:val="o"/>
+      <w:lvlJc w:val="left"/>
+      <w:pPr>
+        <w:tabs>
+          <w:tab w:val="num" w:pos="1440"/>
+        </w:tabs>
+        <w:ind w:left="1440" w:hanging="360"/>
+      </w:pPr>
+      <w:rPr>
+        <w:rFonts w:ascii="Courier New" w:hAnsi="Courier New" w:hint="default"/>
+        <w:sz w:val="20"/>
+      </w:rPr>
+    </w:lvl>
+    <w:lvl w:ilvl="2" w:tentative="1">
+      <w:start w:val="1"/>
+      <w:numFmt w:val="bullet"/>
+      <w:lvlText w:val=""/>
+      <w:lvlJc w:val="left"/>
+      <w:pPr>
+        <w:tabs>
+          <w:tab w:val="num" w:pos="2160"/>
+        </w:tabs>
+        <w:ind w:left="2160" w:hanging="360"/>
+      </w:pPr>
+      <w:rPr>
+        <w:rFonts w:ascii="Wingdings" w:hAnsi="Wingdings" w:hint="default"/>
+        <w:sz w:val="20"/>
+      </w:rPr>
+    </w:lvl>
+    <w:lvl w:ilvl="3" w:tentative="1">
+      <w:start w:val="1"/>
+      <w:numFmt w:val="bullet"/>
+      <w:lvlText w:val=""/>
+      <w:lvlJc w:val="left"/>
+      <w:pPr>
+        <w:tabs>
+          <w:tab w:val="num" w:pos="2880"/>
+        </w:tabs>
+        <w:ind w:left="2880" w:hanging="360"/>
+      </w:pPr>
+      <w:rPr>
+        <w:rFonts w:ascii="Wingdings" w:hAnsi="Wingdings" w:hint="default"/>
+        <w:sz w:val="20"/>
+      </w:rPr>
+    </w:lvl>
+    <w:lvl w:ilvl="4" w:tentative="1">
+      <w:start w:val="1"/>
+      <w:numFmt w:val="bullet"/>
+      <w:lvlText w:val=""/>
+      <w:lvlJc w:val="left"/>
+      <w:pPr>
+        <w:tabs>
+          <w:tab w:val="num" w:pos="3600"/>
+        </w:tabs>
+        <w:ind w:left="3600" w:hanging="360"/>
+      </w:pPr>
+      <w:rPr>
+        <w:rFonts w:ascii="Wingdings" w:hAnsi="Wingdings" w:hint="default"/>
+        <w:sz w:val="20"/>
+      </w:rPr>
+    </w:lvl>
+    <w:lvl w:ilvl="5" w:tentative="1">
+      <w:start w:val="1"/>
+      <w:numFmt w:val="bullet"/>
+      <w:lvlText w:val=""/>
+      <w:lvlJc w:val="left"/>
+      <w:pPr>
+        <w:tabs>
+          <w:tab w:val="num" w:pos="4320"/>
+        </w:tabs>
+        <w:ind w:left="4320" w:hanging="360"/>
+      </w:pPr>
+      <w:rPr>
+        <w:rFonts w:ascii="Wingdings" w:hAnsi="Wingdings" w:hint="default"/>
+        <w:sz w:val="20"/>
+      </w:rPr>
+    </w:lvl>
+    <w:lvl w:ilvl="6" w:tentative="1">
+      <w:start w:val="1"/>
+      <w:numFmt w:val="bullet"/>
+      <w:lvlText w:val=""/>
+      <w:lvlJc w:val="left"/>
+      <w:pPr>
+        <w:tabs>
+          <w:tab w:val="num" w:pos="5040"/>
+        </w:tabs>
+        <w:ind w:left="5040" w:hanging="360"/>
+      </w:pPr>
+      <w:rPr>
+        <w:rFonts w:ascii="Wingdings" w:hAnsi="Wingdings" w:hint="default"/>
+        <w:sz w:val="20"/>
+      </w:rPr>
+    </w:lvl>
+    <w:lvl w:ilvl="7" w:tentative="1">
+      <w:start w:val="1"/>
+      <w:numFmt w:val="bullet"/>
+      <w:lvlText w:val=""/>
+      <w:lvlJc w:val="left"/>
+      <w:pPr>
+        <w:tabs>
+          <w:tab w:val="num" w:pos="5760"/>
+        </w:tabs>
+        <w:ind w:left="5760" w:hanging="360"/>
+      </w:pPr>
+      <w:rPr>
+        <w:rFonts w:ascii="Wingdings" w:hAnsi="Wingdings" w:hint="default"/>
+        <w:sz w:val="20"/>
+      </w:rPr>
+    </w:lvl>
+    <w:lvl w:ilvl="8" w:tentative="1">
+      <w:start w:val="1"/>
+      <w:numFmt w:val="bullet"/>
+      <w:lvlText w:val=""/>
+      <w:lvlJc w:val="left"/>
+      <w:pPr>
+        <w:tabs>
+          <w:tab w:val="num" w:pos="6480"/>
+        </w:tabs>
+        <w:ind w:left="6480" w:hanging="360"/>
+      </w:pPr>
+      <w:rPr>
+        <w:rFonts w:ascii="Wingdings" w:hAnsi="Wingdings" w:hint="default"/>
+        <w:sz w:val="20"/>
+      </w:rPr>
+    </w:lvl>
+  </w:abstractNum>
+  <w:abstractNum w:abstractNumId="4" w15:restartNumberingAfterBreak="0">
     <w:nsid w:val="0ACD197C"/>
     <w:multiLevelType w:val="multilevel"/>
     <w:tmpl w:val="DADE2C1C"/>
@@ -681,7 +1349,156 @@
       </w:rPr>
     </w:lvl>
   </w:abstractNum>
-  <w:abstractNum w:abstractNumId="3" w15:restartNumberingAfterBreak="0">
+  <w:abstractNum w:abstractNumId="5" w15:restartNumberingAfterBreak="0">
+    <w:nsid w:val="0BC36F01"/>
+    <w:multiLevelType w:val="multilevel"/>
+    <w:tmpl w:val="6DC45A52"/>
+    <w:lvl w:ilvl="0">
+      <w:start w:val="1"/>
+      <w:numFmt w:val="bullet"/>
+      <w:lvlText w:val=""/>
+      <w:lvlJc w:val="left"/>
+      <w:pPr>
+        <w:tabs>
+          <w:tab w:val="num" w:pos="720"/>
+        </w:tabs>
+        <w:ind w:left="720" w:hanging="360"/>
+      </w:pPr>
+      <w:rPr>
+        <w:rFonts w:ascii="Symbol" w:hAnsi="Symbol" w:hint="default"/>
+        <w:sz w:val="20"/>
+      </w:rPr>
+    </w:lvl>
+    <w:lvl w:ilvl="1" w:tentative="1">
+      <w:start w:val="1"/>
+      <w:numFmt w:val="bullet"/>
+      <w:lvlText w:val="o"/>
+      <w:lvlJc w:val="left"/>
+      <w:pPr>
+        <w:tabs>
+          <w:tab w:val="num" w:pos="1440"/>
+        </w:tabs>
+        <w:ind w:left="1440" w:hanging="360"/>
+      </w:pPr>
+      <w:rPr>
+        <w:rFonts w:ascii="Courier New" w:hAnsi="Courier New" w:hint="default"/>
+        <w:sz w:val="20"/>
+      </w:rPr>
+    </w:lvl>
+    <w:lvl w:ilvl="2" w:tentative="1">
+      <w:start w:val="1"/>
+      <w:numFmt w:val="bullet"/>
+      <w:lvlText w:val=""/>
+      <w:lvlJc w:val="left"/>
+      <w:pPr>
+        <w:tabs>
+          <w:tab w:val="num" w:pos="2160"/>
+        </w:tabs>
+        <w:ind w:left="2160" w:hanging="360"/>
+      </w:pPr>
+      <w:rPr>
+        <w:rFonts w:ascii="Wingdings" w:hAnsi="Wingdings" w:hint="default"/>
+        <w:sz w:val="20"/>
+      </w:rPr>
+    </w:lvl>
+    <w:lvl w:ilvl="3" w:tentative="1">
+      <w:start w:val="1"/>
+      <w:numFmt w:val="bullet"/>
+      <w:lvlText w:val=""/>
+      <w:lvlJc w:val="left"/>
+      <w:pPr>
+        <w:tabs>
+          <w:tab w:val="num" w:pos="2880"/>
+        </w:tabs>
+        <w:ind w:left="2880" w:hanging="360"/>
+      </w:pPr>
+      <w:rPr>
+        <w:rFonts w:ascii="Wingdings" w:hAnsi="Wingdings" w:hint="default"/>
+        <w:sz w:val="20"/>
+      </w:rPr>
+    </w:lvl>
+    <w:lvl w:ilvl="4" w:tentative="1">
+      <w:start w:val="1"/>
+      <w:numFmt w:val="bullet"/>
+      <w:lvlText w:val=""/>
+      <w:lvlJc w:val="left"/>
+      <w:pPr>
+        <w:tabs>
+          <w:tab w:val="num" w:pos="3600"/>
+        </w:tabs>
+        <w:ind w:left="3600" w:hanging="360"/>
+      </w:pPr>
+      <w:rPr>
+        <w:rFonts w:ascii="Wingdings" w:hAnsi="Wingdings" w:hint="default"/>
+        <w:sz w:val="20"/>
+      </w:rPr>
+    </w:lvl>
+    <w:lvl w:ilvl="5" w:tentative="1">
+      <w:start w:val="1"/>
+      <w:numFmt w:val="bullet"/>
+      <w:lvlText w:val=""/>
+      <w:lvlJc w:val="left"/>
+      <w:pPr>
+        <w:tabs>
+          <w:tab w:val="num" w:pos="4320"/>
+        </w:tabs>
+        <w:ind w:left="4320" w:hanging="360"/>
+      </w:pPr>
+      <w:rPr>
+        <w:rFonts w:ascii="Wingdings" w:hAnsi="Wingdings" w:hint="default"/>
+        <w:sz w:val="20"/>
+      </w:rPr>
+    </w:lvl>
+    <w:lvl w:ilvl="6" w:tentative="1">
+      <w:start w:val="1"/>
+      <w:numFmt w:val="bullet"/>
+      <w:lvlText w:val=""/>
+      <w:lvlJc w:val="left"/>
+      <w:pPr>
+        <w:tabs>
+          <w:tab w:val="num" w:pos="5040"/>
+        </w:tabs>
+        <w:ind w:left="5040" w:hanging="360"/>
+      </w:pPr>
+      <w:rPr>
+        <w:rFonts w:ascii="Wingdings" w:hAnsi="Wingdings" w:hint="default"/>
+        <w:sz w:val="20"/>
+      </w:rPr>
+    </w:lvl>
+    <w:lvl w:ilvl="7" w:tentative="1">
+      <w:start w:val="1"/>
+      <w:numFmt w:val="bullet"/>
+      <w:lvlText w:val=""/>
+      <w:lvlJc w:val="left"/>
+      <w:pPr>
+        <w:tabs>
+          <w:tab w:val="num" w:pos="5760"/>
+        </w:tabs>
+        <w:ind w:left="5760" w:hanging="360"/>
+      </w:pPr>
+      <w:rPr>
+        <w:rFonts w:ascii="Wingdings" w:hAnsi="Wingdings" w:hint="default"/>
+        <w:sz w:val="20"/>
+      </w:rPr>
+    </w:lvl>
+    <w:lvl w:ilvl="8" w:tentative="1">
+      <w:start w:val="1"/>
+      <w:numFmt w:val="bullet"/>
+      <w:lvlText w:val=""/>
+      <w:lvlJc w:val="left"/>
+      <w:pPr>
+        <w:tabs>
+          <w:tab w:val="num" w:pos="6480"/>
+        </w:tabs>
+        <w:ind w:left="6480" w:hanging="360"/>
+      </w:pPr>
+      <w:rPr>
+        <w:rFonts w:ascii="Wingdings" w:hAnsi="Wingdings" w:hint="default"/>
+        <w:sz w:val="20"/>
+      </w:rPr>
+    </w:lvl>
+  </w:abstractNum>
+  <w:abstractNum w:abstractNumId="6" w15:restartNumberingAfterBreak="0">
     <w:nsid w:val="126273B3"/>
     <w:multiLevelType w:val="multilevel"/>
     <w:tmpl w:val="B680FA3E"/>
@@ -830,7 +1647,7 @@
       </w:rPr>
     </w:lvl>
   </w:abstractNum>
-  <w:abstractNum w:abstractNumId="4" w15:restartNumberingAfterBreak="0">
+  <w:abstractNum w:abstractNumId="7" w15:restartNumberingAfterBreak="0">
     <w:nsid w:val="27005AF8"/>
     <w:multiLevelType w:val="multilevel"/>
     <w:tmpl w:val="417C87B4"/>
@@ -979,7 +1796,7 @@
       </w:rPr>
     </w:lvl>
   </w:abstractNum>
-  <w:abstractNum w:abstractNumId="5" w15:restartNumberingAfterBreak="0">
+  <w:abstractNum w:abstractNumId="8" w15:restartNumberingAfterBreak="0">
     <w:nsid w:val="2AD44C84"/>
     <w:multiLevelType w:val="multilevel"/>
     <w:tmpl w:val="50AEA506"/>
@@ -1128,7 +1945,7 @@
       </w:rPr>
     </w:lvl>
   </w:abstractNum>
-  <w:abstractNum w:abstractNumId="6" w15:restartNumberingAfterBreak="0">
+  <w:abstractNum w:abstractNumId="9" w15:restartNumberingAfterBreak="0">
     <w:nsid w:val="3F654DB4"/>
     <w:multiLevelType w:val="hybridMultilevel"/>
     <w:tmpl w:val="6F72CD76"/>
@@ -1217,7 +2034,7 @@
       </w:pPr>
     </w:lvl>
   </w:abstractNum>
-  <w:abstractNum w:abstractNumId="7" w15:restartNumberingAfterBreak="0">
+  <w:abstractNum w:abstractNumId="10" w15:restartNumberingAfterBreak="0">
     <w:nsid w:val="47595732"/>
     <w:multiLevelType w:val="hybridMultilevel"/>
     <w:tmpl w:val="5442EC70"/>
@@ -1227,7 +2044,7 @@
       <w:lvlText w:val="%1."/>
       <w:lvlJc w:val="left"/>
       <w:pPr>
-        <w:ind w:left="720" w:hanging="360"/>
+        <w:ind w:left="360" w:hanging="360"/>
       </w:pPr>
       <w:rPr>
         <w:rFonts w:hint="default"/>
@@ -1239,7 +2056,7 @@
       <w:lvlText w:val="%2."/>
       <w:lvlJc w:val="left"/>
       <w:pPr>
-        <w:ind w:left="1440" w:hanging="360"/>
+        <w:ind w:left="1080" w:hanging="360"/>
       </w:pPr>
     </w:lvl>
     <w:lvl w:ilvl="2" w:tplc="2000001B" w:tentative="1">
@@ -1248,7 +2065,7 @@
       <w:lvlText w:val="%3."/>
       <w:lvlJc w:val="right"/>
       <w:pPr>
-        <w:ind w:left="2160" w:hanging="180"/>
+        <w:ind w:left="1800" w:hanging="180"/>
       </w:pPr>
     </w:lvl>
     <w:lvl w:ilvl="3" w:tplc="2000000F" w:tentative="1">
@@ -1257,7 +2074,7 @@
       <w:lvlText w:val="%4."/>
       <w:lvlJc w:val="left"/>
       <w:pPr>
-        <w:ind w:left="2880" w:hanging="360"/>
+        <w:ind w:left="2520" w:hanging="360"/>
       </w:pPr>
     </w:lvl>
     <w:lvl w:ilvl="4" w:tplc="20000019" w:tentative="1">
@@ -1266,7 +2083,7 @@
       <w:lvlText w:val="%5."/>
       <w:lvlJc w:val="left"/>
       <w:pPr>
-        <w:ind w:left="3600" w:hanging="360"/>
+        <w:ind w:left="3240" w:hanging="360"/>
       </w:pPr>
     </w:lvl>
     <w:lvl w:ilvl="5" w:tplc="2000001B" w:tentative="1">
@@ -1275,7 +2092,7 @@
       <w:lvlText w:val="%6."/>
       <w:lvlJc w:val="right"/>
       <w:pPr>
-        <w:ind w:left="4320" w:hanging="180"/>
+        <w:ind w:left="3960" w:hanging="180"/>
       </w:pPr>
     </w:lvl>
     <w:lvl w:ilvl="6" w:tplc="2000000F" w:tentative="1">
@@ -1284,7 +2101,7 @@
       <w:lvlText w:val="%7."/>
       <w:lvlJc w:val="left"/>
       <w:pPr>
-        <w:ind w:left="5040" w:hanging="360"/>
+        <w:ind w:left="4680" w:hanging="360"/>
       </w:pPr>
     </w:lvl>
     <w:lvl w:ilvl="7" w:tplc="20000019" w:tentative="1">
@@ -1293,7 +2110,7 @@
       <w:lvlText w:val="%8."/>
       <w:lvlJc w:val="left"/>
       <w:pPr>
-        <w:ind w:left="5760" w:hanging="360"/>
+        <w:ind w:left="5400" w:hanging="360"/>
       </w:pPr>
     </w:lvl>
     <w:lvl w:ilvl="8" w:tplc="2000001B" w:tentative="1">
@@ -1302,24 +2119,173 @@
       <w:lvlText w:val="%9."/>
       <w:lvlJc w:val="right"/>
       <w:pPr>
-        <w:ind w:left="6480" w:hanging="180"/>
-      </w:pPr>
+        <w:ind w:left="6120" w:hanging="180"/>
+      </w:pPr>
+    </w:lvl>
+  </w:abstractNum>
+  <w:abstractNum w:abstractNumId="11" w15:restartNumberingAfterBreak="0">
+    <w:nsid w:val="6E0749EE"/>
+    <w:multiLevelType w:val="multilevel"/>
+    <w:tmpl w:val="C1FEA11A"/>
+    <w:lvl w:ilvl="0">
+      <w:start w:val="1"/>
+      <w:numFmt w:val="bullet"/>
+      <w:lvlText w:val=""/>
+      <w:lvlJc w:val="left"/>
+      <w:pPr>
+        <w:tabs>
+          <w:tab w:val="num" w:pos="720"/>
+        </w:tabs>
+        <w:ind w:left="720" w:hanging="360"/>
+      </w:pPr>
+      <w:rPr>
+        <w:rFonts w:ascii="Symbol" w:hAnsi="Symbol" w:hint="default"/>
+        <w:sz w:val="20"/>
+      </w:rPr>
+    </w:lvl>
+    <w:lvl w:ilvl="1" w:tentative="1">
+      <w:start w:val="1"/>
+      <w:numFmt w:val="bullet"/>
+      <w:lvlText w:val="o"/>
+      <w:lvlJc w:val="left"/>
+      <w:pPr>
+        <w:tabs>
+          <w:tab w:val="num" w:pos="1440"/>
+        </w:tabs>
+        <w:ind w:left="1440" w:hanging="360"/>
+      </w:pPr>
+      <w:rPr>
+        <w:rFonts w:ascii="Courier New" w:hAnsi="Courier New" w:hint="default"/>
+        <w:sz w:val="20"/>
+      </w:rPr>
+    </w:lvl>
+    <w:lvl w:ilvl="2" w:tentative="1">
+      <w:start w:val="1"/>
+      <w:numFmt w:val="bullet"/>
+      <w:lvlText w:val=""/>
+      <w:lvlJc w:val="left"/>
+      <w:pPr>
+        <w:tabs>
+          <w:tab w:val="num" w:pos="2160"/>
+        </w:tabs>
+        <w:ind w:left="2160" w:hanging="360"/>
+      </w:pPr>
+      <w:rPr>
+        <w:rFonts w:ascii="Wingdings" w:hAnsi="Wingdings" w:hint="default"/>
+        <w:sz w:val="20"/>
+      </w:rPr>
+    </w:lvl>
+    <w:lvl w:ilvl="3" w:tentative="1">
+      <w:start w:val="1"/>
+      <w:numFmt w:val="bullet"/>
+      <w:lvlText w:val=""/>
+      <w:lvlJc w:val="left"/>
+      <w:pPr>
+        <w:tabs>
+          <w:tab w:val="num" w:pos="2880"/>
+        </w:tabs>
+        <w:ind w:left="2880" w:hanging="360"/>
+      </w:pPr>
+      <w:rPr>
+        <w:rFonts w:ascii="Wingdings" w:hAnsi="Wingdings" w:hint="default"/>
+        <w:sz w:val="20"/>
+      </w:rPr>
+    </w:lvl>
+    <w:lvl w:ilvl="4" w:tentative="1">
+      <w:start w:val="1"/>
+      <w:numFmt w:val="bullet"/>
+      <w:lvlText w:val=""/>
+      <w:lvlJc w:val="left"/>
+      <w:pPr>
+        <w:tabs>
+          <w:tab w:val="num" w:pos="3600"/>
+        </w:tabs>
+        <w:ind w:left="3600" w:hanging="360"/>
+      </w:pPr>
+      <w:rPr>
+        <w:rFonts w:ascii="Wingdings" w:hAnsi="Wingdings" w:hint="default"/>
+        <w:sz w:val="20"/>
+      </w:rPr>
+    </w:lvl>
+    <w:lvl w:ilvl="5" w:tentative="1">
+      <w:start w:val="1"/>
+      <w:numFmt w:val="bullet"/>
+      <w:lvlText w:val=""/>
+      <w:lvlJc w:val="left"/>
+      <w:pPr>
+        <w:tabs>
+          <w:tab w:val="num" w:pos="4320"/>
+        </w:tabs>
+        <w:ind w:left="4320" w:hanging="360"/>
+      </w:pPr>
+      <w:rPr>
+        <w:rFonts w:ascii="Wingdings" w:hAnsi="Wingdings" w:hint="default"/>
+        <w:sz w:val="20"/>
+      </w:rPr>
+    </w:lvl>
+    <w:lvl w:ilvl="6" w:tentative="1">
+      <w:start w:val="1"/>
+      <w:numFmt w:val="bullet"/>
+      <w:lvlText w:val=""/>
+      <w:lvlJc w:val="left"/>
+      <w:pPr>
+        <w:tabs>
+          <w:tab w:val="num" w:pos="5040"/>
+        </w:tabs>
+        <w:ind w:left="5040" w:hanging="360"/>
+      </w:pPr>
+      <w:rPr>
+        <w:rFonts w:ascii="Wingdings" w:hAnsi="Wingdings" w:hint="default"/>
+        <w:sz w:val="20"/>
+      </w:rPr>
+    </w:lvl>
+    <w:lvl w:ilvl="7" w:tentative="1">
+      <w:start w:val="1"/>
+      <w:numFmt w:val="bullet"/>
+      <w:lvlText w:val=""/>
+      <w:lvlJc w:val="left"/>
+      <w:pPr>
+        <w:tabs>
+          <w:tab w:val="num" w:pos="5760"/>
+        </w:tabs>
+        <w:ind w:left="5760" w:hanging="360"/>
+      </w:pPr>
+      <w:rPr>
+        <w:rFonts w:ascii="Wingdings" w:hAnsi="Wingdings" w:hint="default"/>
+        <w:sz w:val="20"/>
+      </w:rPr>
+    </w:lvl>
+    <w:lvl w:ilvl="8" w:tentative="1">
+      <w:start w:val="1"/>
+      <w:numFmt w:val="bullet"/>
+      <w:lvlText w:val=""/>
+      <w:lvlJc w:val="left"/>
+      <w:pPr>
+        <w:tabs>
+          <w:tab w:val="num" w:pos="6480"/>
+        </w:tabs>
+        <w:ind w:left="6480" w:hanging="360"/>
+      </w:pPr>
+      <w:rPr>
+        <w:rFonts w:ascii="Wingdings" w:hAnsi="Wingdings" w:hint="default"/>
+        <w:sz w:val="20"/>
+      </w:rPr>
     </w:lvl>
   </w:abstractNum>
   <w:num w:numId="1" w16cid:durableId="1171219683">
-    <w:abstractNumId w:val="6"/>
+    <w:abstractNumId w:val="9"/>
   </w:num>
   <w:num w:numId="2" w16cid:durableId="1240217354">
-    <w:abstractNumId w:val="2"/>
+    <w:abstractNumId w:val="4"/>
   </w:num>
   <w:num w:numId="3" w16cid:durableId="1313604625">
-    <w:abstractNumId w:val="4"/>
+    <w:abstractNumId w:val="7"/>
   </w:num>
   <w:num w:numId="4" w16cid:durableId="868958472">
-    <w:abstractNumId w:val="5"/>
+    <w:abstractNumId w:val="8"/>
   </w:num>
   <w:num w:numId="5" w16cid:durableId="1655454319">
-    <w:abstractNumId w:val="3"/>
+    <w:abstractNumId w:val="6"/>
   </w:num>
   <w:num w:numId="6" w16cid:durableId="2138906939">
     <w:abstractNumId w:val="1"/>
@@ -1328,7 +2294,19 @@
     <w:abstractNumId w:val="0"/>
   </w:num>
   <w:num w:numId="8" w16cid:durableId="1706128782">
-    <w:abstractNumId w:val="7"/>
+    <w:abstractNumId w:val="10"/>
+  </w:num>
+  <w:num w:numId="9" w16cid:durableId="1013148965">
+    <w:abstractNumId w:val="2"/>
+  </w:num>
+  <w:num w:numId="10" w16cid:durableId="2016574198">
+    <w:abstractNumId w:val="11"/>
+  </w:num>
+  <w:num w:numId="11" w16cid:durableId="782529323">
+    <w:abstractNumId w:val="5"/>
+  </w:num>
+  <w:num w:numId="12" w16cid:durableId="713768620">
+    <w:abstractNumId w:val="3"/>
   </w:num>
 </w:numbering>
 </file>

</xml_diff>

<commit_message>
new morning briefing with emoji
</commit_message>
<xml_diff>
--- a/Knows_me_coach.docx
+++ b/Knows_me_coach.docx
@@ -13,409 +13,15 @@
     </w:p>
     <w:p>
       <w:pPr>
-        <w:rPr>
-          <w:lang w:val="en-IL"/>
-        </w:rPr>
-      </w:pPr>
-      <w:r>
-        <w:rPr>
-          <w:lang w:val="en-IL"/>
-        </w:rPr>
-        <w:t>/</w:t>
-      </w:r>
-      <w:r>
-        <w:rPr>
-          <w:highlight w:val="yellow"/>
-          <w:lang w:val="en-IL"/>
-        </w:rPr>
-        <w:t>start</w:t>
-      </w:r>
-      <w:r>
-        <w:rPr>
-          <w:lang w:val="en-IL"/>
-        </w:rPr>
-        <w:t> Profile Wizard — Implementation Summary</w:t>
-      </w:r>
-    </w:p>
-    <w:p>
-      <w:pPr>
-        <w:rPr>
-          <w:lang w:val="en-IL"/>
-        </w:rPr>
-      </w:pPr>
-      <w:r>
-        <w:rPr>
-          <w:lang w:val="en-IL"/>
-        </w:rPr>
-        <w:t>What it should do</w:t>
-      </w:r>
-    </w:p>
-    <w:p>
-      <w:pPr>
-        <w:rPr>
-          <w:lang w:val="en-IL"/>
-        </w:rPr>
-      </w:pPr>
-      <w:r>
-        <w:rPr>
-          <w:lang w:val="en-IL"/>
-        </w:rPr>
-        <w:t>When /start is called, check if the profile in DynamoDB has all required fields. If fields are missing, run a sequential wizard before anything else. If the profile is already complete, just greet and show available commands.</w:t>
-      </w:r>
-    </w:p>
-    <w:p>
-      <w:pPr>
-        <w:rPr>
-          <w:lang w:val="en-IL"/>
-        </w:rPr>
-      </w:pPr>
-      <w:r>
-        <w:rPr>
-          <w:lang w:val="en-IL"/>
-        </w:rPr>
-        <w:t>Fields to collect (in order)</w:t>
-      </w:r>
-    </w:p>
-    <w:p>
-      <w:pPr>
-        <w:numPr>
-          <w:ilvl w:val="0"/>
-          <w:numId w:val="9"/>
-        </w:numPr>
-        <w:rPr>
-          <w:lang w:val="en-IL"/>
-        </w:rPr>
-      </w:pPr>
-      <w:r>
-        <w:rPr>
-          <w:lang w:val="en-IL"/>
-        </w:rPr>
-        <w:t>Name — free text</w:t>
-      </w:r>
-    </w:p>
-    <w:p>
-      <w:pPr>
-        <w:numPr>
-          <w:ilvl w:val="0"/>
-          <w:numId w:val="9"/>
-        </w:numPr>
-        <w:rPr>
-          <w:lang w:val="en-IL"/>
-        </w:rPr>
-      </w:pPr>
-      <w:r>
-        <w:rPr>
-          <w:lang w:val="en-IL"/>
-        </w:rPr>
-        <w:t>Age — number</w:t>
-      </w:r>
-    </w:p>
-    <w:p>
-      <w:pPr>
-        <w:numPr>
-          <w:ilvl w:val="0"/>
-          <w:numId w:val="9"/>
-        </w:numPr>
-        <w:rPr>
-          <w:lang w:val="en-IL"/>
-        </w:rPr>
-      </w:pPr>
-      <w:r>
-        <w:rPr>
-          <w:lang w:val="en-IL"/>
-        </w:rPr>
-        <w:t>Weight — number (kg)</w:t>
-      </w:r>
-    </w:p>
-    <w:p>
-      <w:pPr>
-        <w:numPr>
-          <w:ilvl w:val="0"/>
-          <w:numId w:val="9"/>
-        </w:numPr>
-        <w:rPr>
-          <w:lang w:val="en-IL"/>
-        </w:rPr>
-      </w:pPr>
-      <w:r>
-        <w:rPr>
-          <w:lang w:val="en-IL"/>
-        </w:rPr>
-        <w:t>Goal — inline keyboard: Cut / Maintain / Bulk</w:t>
-      </w:r>
-    </w:p>
-    <w:p>
-      <w:pPr>
-        <w:numPr>
-          <w:ilvl w:val="0"/>
-          <w:numId w:val="9"/>
-        </w:numPr>
-        <w:rPr>
-          <w:lang w:val="en-IL"/>
-        </w:rPr>
-      </w:pPr>
-      <w:r>
-        <w:rPr>
-          <w:lang w:val="en-IL"/>
-        </w:rPr>
-        <w:t>Fitness level — inline keyboard: Beginner / Intermediate / Advanced</w:t>
-      </w:r>
-    </w:p>
-    <w:p>
-      <w:pPr>
-        <w:numPr>
-          <w:ilvl w:val="0"/>
-          <w:numId w:val="9"/>
-        </w:numPr>
-        <w:rPr>
-          <w:lang w:val="en-IL"/>
-        </w:rPr>
-      </w:pPr>
-      <w:r>
-        <w:rPr>
-          <w:lang w:val="en-IL"/>
-        </w:rPr>
-        <w:t>Weekly training days — number (1–7)</w:t>
-      </w:r>
-    </w:p>
-    <w:p>
-      <w:pPr>
-        <w:numPr>
-          <w:ilvl w:val="0"/>
-          <w:numId w:val="9"/>
-        </w:numPr>
-        <w:rPr>
-          <w:lang w:val="en-IL"/>
-        </w:rPr>
-      </w:pPr>
-      <w:r>
-        <w:rPr>
-          <w:lang w:val="en-IL"/>
-        </w:rPr>
-        <w:t>Session duration — number in minutes (default suggestion: 60)</w:t>
-      </w:r>
-    </w:p>
-    <w:p>
-      <w:pPr>
-        <w:numPr>
-          <w:ilvl w:val="0"/>
-          <w:numId w:val="9"/>
-        </w:numPr>
-        <w:rPr>
-          <w:lang w:val="en-IL"/>
-        </w:rPr>
-      </w:pPr>
-      <w:r>
-        <w:rPr>
-          <w:lang w:val="en-IL"/>
-        </w:rPr>
-        <w:t>Dietary restrictions — free text, or "None" button to skip</w:t>
-      </w:r>
-    </w:p>
-    <w:p>
-      <w:pPr>
-        <w:rPr>
-          <w:lang w:val="en-IL"/>
-        </w:rPr>
-      </w:pPr>
-      <w:r>
-        <w:rPr>
-          <w:lang w:val="en-IL"/>
-        </w:rPr>
-        <w:t>Where data lives</w:t>
-      </w:r>
-    </w:p>
-    <w:p>
-      <w:pPr>
-        <w:rPr>
-          <w:lang w:val="en-IL"/>
-        </w:rPr>
-      </w:pPr>
-      <w:r>
-        <w:rPr>
-          <w:lang w:val="en-IL"/>
-        </w:rPr>
-        <w:t>All fields saved to DynamoDB via storage.save_profile(). Map to existing keys used by workout_recommender.py:</w:t>
-      </w:r>
-    </w:p>
-    <w:p>
-      <w:pPr>
-        <w:numPr>
-          <w:ilvl w:val="0"/>
-          <w:numId w:val="10"/>
-        </w:numPr>
-        <w:rPr>
-          <w:lang w:val="en-IL"/>
-        </w:rPr>
-      </w:pPr>
-      <w:r>
-        <w:rPr>
-          <w:lang w:val="en-IL"/>
-        </w:rPr>
-        <w:t>name, age, weight_kg, primary_goal, fitness_level, weekly_training_days, preferred_session_duration_minutes, dietary_restrictions</w:t>
-      </w:r>
-    </w:p>
-    <w:p>
-      <w:pPr>
-        <w:rPr>
-          <w:lang w:val="en-IL"/>
-        </w:rPr>
-      </w:pPr>
-      <w:r>
-        <w:rPr>
-          <w:lang w:val="en-IL"/>
-        </w:rPr>
-        <w:t>Implementation approach</w:t>
-      </w:r>
-    </w:p>
-    <w:p>
-      <w:pPr>
-        <w:numPr>
-          <w:ilvl w:val="0"/>
-          <w:numId w:val="11"/>
-        </w:numPr>
-        <w:rPr>
-          <w:lang w:val="en-IL"/>
-        </w:rPr>
-      </w:pPr>
-      <w:r>
-        <w:rPr>
-          <w:lang w:val="en-IL"/>
-        </w:rPr>
-        <w:t>Use PTB's ConversationHandler with one state per question</w:t>
-      </w:r>
-    </w:p>
-    <w:p>
-      <w:pPr>
-        <w:numPr>
-          <w:ilvl w:val="0"/>
-          <w:numId w:val="11"/>
-        </w:numPr>
-        <w:rPr>
-          <w:lang w:val="en-IL"/>
-        </w:rPr>
-      </w:pPr>
-      <w:r>
-        <w:rPr>
-          <w:lang w:val="en-IL"/>
-        </w:rPr>
-        <w:t>On /start: load profile → skip already-filled fields → start wizard from first missing field</w:t>
-      </w:r>
-    </w:p>
-    <w:p>
-      <w:pPr>
-        <w:numPr>
-          <w:ilvl w:val="0"/>
-          <w:numId w:val="11"/>
-        </w:numPr>
-        <w:rPr>
-          <w:lang w:val="en-IL"/>
-        </w:rPr>
-      </w:pPr>
-      <w:r>
-        <w:rPr>
-          <w:lang w:val="en-IL"/>
-        </w:rPr>
-        <w:t>On completion: save profile, send confirmation, show available commands (/morning, /clear, etc.)</w:t>
-      </w:r>
-    </w:p>
-    <w:p>
-      <w:pPr>
-        <w:numPr>
-          <w:ilvl w:val="0"/>
-          <w:numId w:val="11"/>
-        </w:numPr>
-        <w:rPr>
-          <w:lang w:val="en-IL"/>
-        </w:rPr>
-      </w:pPr>
-      <w:r>
-        <w:rPr>
-          <w:lang w:val="en-IL"/>
-        </w:rPr>
-        <w:t>/profile command reuses the same ConversationHandler to let you update any field later</w:t>
-      </w:r>
-    </w:p>
-    <w:p>
-      <w:pPr>
-        <w:rPr>
-          <w:lang w:val="en-IL"/>
-        </w:rPr>
-      </w:pPr>
-      <w:r>
-        <w:rPr>
-          <w:lang w:val="en-IL"/>
-        </w:rPr>
-        <w:t>Files to touch</w:t>
-      </w:r>
-    </w:p>
-    <w:p>
-      <w:pPr>
-        <w:numPr>
-          <w:ilvl w:val="0"/>
-          <w:numId w:val="12"/>
-        </w:numPr>
-        <w:rPr>
-          <w:lang w:val="en-IL"/>
-        </w:rPr>
-      </w:pPr>
-      <w:r>
-        <w:rPr>
-          <w:lang w:val="en-IL"/>
-        </w:rPr>
-        <w:t>bot.py — add ConversationHandler, replace current start() handler</w:t>
-      </w:r>
-    </w:p>
-    <w:p>
-      <w:pPr>
-        <w:numPr>
-          <w:ilvl w:val="0"/>
-          <w:numId w:val="12"/>
-        </w:numPr>
-        <w:rPr>
-          <w:lang w:val="en-IL"/>
-        </w:rPr>
-      </w:pPr>
-      <w:r>
-        <w:rPr>
-          <w:lang w:val="en-IL"/>
-        </w:rPr>
-        <w:t>storage.py — no changes needed, save_profile already handles this</w:t>
-      </w:r>
-    </w:p>
-    <w:p>
-      <w:pPr>
-        <w:rPr>
-          <w:b/>
-          <w:bCs/>
-          <w:lang w:val="en-IL"/>
-        </w:rPr>
-      </w:pPr>
-    </w:p>
-    <w:p>
-      <w:pPr>
-        <w:rPr>
-          <w:b/>
-          <w:bCs/>
-        </w:rPr>
-      </w:pPr>
-    </w:p>
-    <w:p>
-      <w:pPr>
-        <w:rPr>
-          <w:b/>
-          <w:bCs/>
-        </w:rPr>
-      </w:pPr>
-    </w:p>
-    <w:p>
-      <w:pPr>
         <w:pStyle w:val="ListParagraph"/>
         <w:numPr>
           <w:ilvl w:val="0"/>
           <w:numId w:val="8"/>
         </w:numPr>
       </w:pPr>
+      <w:r>
+        <w:t>Check the /start and /profile commands</w:t>
+      </w:r>
     </w:p>
     <w:p>
       <w:pPr>

</xml_diff>

<commit_message>
With the /start wizard
</commit_message>
<xml_diff>
--- a/Knows_me_coach.docx
+++ b/Knows_me_coach.docx
@@ -65,7 +65,15 @@
         <w:t>Send some pictures or videos (</w:t>
       </w:r>
       <w:r>
-        <w:t>Using Google’s Gemini Or OpenAI’s Whisper for the transcripts)</w:t>
+        <w:t xml:space="preserve">Using Google’s Gemini </w:t>
+      </w:r>
+      <w:proofErr w:type="gramStart"/>
+      <w:r>
+        <w:t>Or</w:t>
+      </w:r>
+      <w:proofErr w:type="gramEnd"/>
+      <w:r>
+        <w:t xml:space="preserve"> OpenAI’s Whisper for the transcripts)</w:t>
       </w:r>
     </w:p>
     <w:p>
@@ -143,7 +151,15 @@
         </w:numPr>
       </w:pPr>
       <w:r>
-        <w:t>Integrate with Strava segments or Komoot for richer route data</w:t>
+        <w:t xml:space="preserve">Integrate with Strava segments or </w:t>
+      </w:r>
+      <w:proofErr w:type="spellStart"/>
+      <w:r>
+        <w:t>Komoot</w:t>
+      </w:r>
+      <w:proofErr w:type="spellEnd"/>
+      <w:r>
+        <w:t xml:space="preserve"> for richer route data</w:t>
       </w:r>
     </w:p>
     <w:p>
@@ -260,16 +276,6 @@
       <w:r>
         <w:t>Public route sharing so users can discover routes others in their city have used</w:t>
       </w:r>
-    </w:p>
-    <w:p/>
-    <w:p/>
-    <w:p/>
-    <w:p>
-      <w:pPr>
-        <w:rPr>
-          <w:lang w:val="en-US"/>
-        </w:rPr>
-      </w:pPr>
     </w:p>
     <w:sectPr>
       <w:pgSz w:w="11906" w:h="16838"/>

</xml_diff>

<commit_message>
restructured garmin and brain
</commit_message>
<xml_diff>
--- a/Knows_me_coach.docx
+++ b/Knows_me_coach.docx
@@ -126,7 +126,34 @@
         </w:numPr>
       </w:pPr>
       <w:r>
-        <w:t>If the user asks to change somthing in his profile it should be possible to change it precisly</w:t>
+        <w:t xml:space="preserve">If the user asks to change somthing in his profile it should be possible to change it </w:t>
+      </w:r>
+      <w:r>
+        <w:t>precisely</w:t>
+      </w:r>
+    </w:p>
+    <w:p>
+      <w:pPr>
+        <w:pStyle w:val="ListParagraph"/>
+        <w:numPr>
+          <w:ilvl w:val="0"/>
+          <w:numId w:val="8"/>
+        </w:numPr>
+      </w:pPr>
+      <w:r>
+        <w:t>It never tells me to have a rest day, why?</w:t>
+      </w:r>
+    </w:p>
+    <w:p>
+      <w:pPr>
+        <w:pStyle w:val="ListParagraph"/>
+        <w:numPr>
+          <w:ilvl w:val="0"/>
+          <w:numId w:val="8"/>
+        </w:numPr>
+      </w:pPr>
+      <w:r>
+        <w:t>Storage – split to more files to rearange</w:t>
       </w:r>
     </w:p>
     <w:p>
@@ -308,6 +335,7 @@
         </w:numPr>
       </w:pPr>
       <w:r>
+        <w:lastRenderedPageBreak/>
         <w:t>Share a challenge with a friend who also uses the app — the agent tracks both and gives light competitive nudges</w:t>
       </w:r>
     </w:p>
@@ -319,7 +347,6 @@
         </w:numPr>
       </w:pPr>
       <w:r>
-        <w:lastRenderedPageBreak/>
         <w:t>Public route sharing so users can discover routes others in their city have used</w:t>
       </w:r>
     </w:p>

</xml_diff>